<commit_message>
resolved mistakes in 1st exercise week8
</commit_message>
<xml_diff>
--- a/week8_GIT/1. git.docx
+++ b/week8_GIT/1. git.docx
@@ -62,7 +62,7 @@
           <w:lang w:val="en-US"/>
         </w:rPr>
         <w:drawing>
-          <wp:inline distT="0" distB="0" distL="0" distR="0" wp14:anchorId="2335CB1C" wp14:editId="168F6E88">
+          <wp:inline distT="0" distB="0" distL="0" distR="0" wp14:anchorId="2335CB1C" wp14:editId="2B8348B9">
             <wp:extent cx="5731510" cy="1432560"/>
             <wp:effectExtent l="0" t="0" r="2540" b="0"/>
             <wp:docPr id="1447938976" name="Picture 2"/>
@@ -77,7 +77,7 @@
                     <pic:cNvPicPr/>
                   </pic:nvPicPr>
                   <pic:blipFill>
-                    <a:blip r:embed="rId4" cstate="print">
+                    <a:blip r:embed="rId5" cstate="print">
                       <a:extLst>
                         <a:ext uri="{28A0092B-C50C-407E-A947-70E740481C1C}">
                           <a14:useLocalDpi xmlns:a14="http://schemas.microsoft.com/office/drawing/2010/main" val="0"/>
@@ -157,7 +157,7 @@
                     <pic:cNvPicPr/>
                   </pic:nvPicPr>
                   <pic:blipFill>
-                    <a:blip r:embed="rId5" cstate="print">
+                    <a:blip r:embed="rId6" cstate="print">
                       <a:extLst>
                         <a:ext uri="{28A0092B-C50C-407E-A947-70E740481C1C}">
                           <a14:useLocalDpi xmlns:a14="http://schemas.microsoft.com/office/drawing/2010/main" val="0"/>
@@ -194,21 +194,7 @@
         <w:rPr>
           <w:lang w:val="en-US"/>
         </w:rPr>
-        <w:t xml:space="preserve">Checked </w:t>
-      </w:r>
-      <w:proofErr w:type="spellStart"/>
-      <w:r>
-        <w:rPr>
-          <w:lang w:val="en-US"/>
-        </w:rPr>
-        <w:t>GitClient</w:t>
-      </w:r>
-      <w:proofErr w:type="spellEnd"/>
-      <w:r>
-        <w:rPr>
-          <w:lang w:val="en-US"/>
-        </w:rPr>
-        <w:t xml:space="preserve"> installed properly or not.</w:t>
+        <w:t>Checked GitClient installed properly or not.</w:t>
       </w:r>
     </w:p>
     <w:p>
@@ -238,7 +224,7 @@
                     <pic:cNvPicPr/>
                   </pic:nvPicPr>
                   <pic:blipFill>
-                    <a:blip r:embed="rId6">
+                    <a:blip r:embed="rId7">
                       <a:extLst>
                         <a:ext uri="{28A0092B-C50C-407E-A947-70E740481C1C}">
                           <a14:useLocalDpi xmlns:a14="http://schemas.microsoft.com/office/drawing/2010/main" val="0"/>
@@ -332,7 +318,7 @@
                     <pic:cNvPicPr/>
                   </pic:nvPicPr>
                   <pic:blipFill>
-                    <a:blip r:embed="rId7">
+                    <a:blip r:embed="rId8">
                       <a:extLst>
                         <a:ext uri="{28A0092B-C50C-407E-A947-70E740481C1C}">
                           <a14:useLocalDpi xmlns:a14="http://schemas.microsoft.com/office/drawing/2010/main" val="0"/>
@@ -399,7 +385,7 @@
                     <pic:cNvPicPr/>
                   </pic:nvPicPr>
                   <pic:blipFill>
-                    <a:blip r:embed="rId8">
+                    <a:blip r:embed="rId9">
                       <a:extLst>
                         <a:ext uri="{28A0092B-C50C-407E-A947-70E740481C1C}">
                           <a14:useLocalDpi xmlns:a14="http://schemas.microsoft.com/office/drawing/2010/main" val="0"/>
@@ -436,13 +422,7 @@
         <w:rPr>
           <w:lang w:val="en-US"/>
         </w:rPr>
-        <w:t>installed it and added</w:t>
-      </w:r>
-      <w:r>
-        <w:rPr>
-          <w:lang w:val="en-US"/>
-        </w:rPr>
-        <w:t xml:space="preserve"> its path to environment variables</w:t>
+        <w:t>installed it and added its path to environment variables</w:t>
       </w:r>
     </w:p>
     <w:p>
@@ -472,7 +452,7 @@
                     <pic:cNvPicPr/>
                   </pic:nvPicPr>
                   <pic:blipFill>
-                    <a:blip r:embed="rId9">
+                    <a:blip r:embed="rId10">
                       <a:extLst>
                         <a:ext uri="{28A0092B-C50C-407E-A947-70E740481C1C}">
                           <a14:useLocalDpi xmlns:a14="http://schemas.microsoft.com/office/drawing/2010/main" val="0"/>
@@ -504,7 +484,7 @@
           <w:lang w:val="en-US"/>
         </w:rPr>
         <w:drawing>
-          <wp:inline distT="0" distB="0" distL="0" distR="0" wp14:anchorId="46031463" wp14:editId="6196E2B7">
+          <wp:inline distT="0" distB="0" distL="0" distR="0" wp14:anchorId="46031463" wp14:editId="1841B32B">
             <wp:extent cx="5731510" cy="3404235"/>
             <wp:effectExtent l="0" t="0" r="2540" b="5715"/>
             <wp:docPr id="1362315233" name="Picture 7"/>
@@ -519,7 +499,7 @@
                     <pic:cNvPicPr/>
                   </pic:nvPicPr>
                   <pic:blipFill>
-                    <a:blip r:embed="rId10" cstate="print">
+                    <a:blip r:embed="rId11" cstate="print">
                       <a:extLst>
                         <a:ext uri="{28A0092B-C50C-407E-A947-70E740481C1C}">
                           <a14:useLocalDpi xmlns:a14="http://schemas.microsoft.com/office/drawing/2010/main" val="0"/>
@@ -574,7 +554,7 @@
                     <pic:cNvPicPr/>
                   </pic:nvPicPr>
                   <pic:blipFill>
-                    <a:blip r:embed="rId11">
+                    <a:blip r:embed="rId12">
                       <a:extLst>
                         <a:ext uri="{28A0092B-C50C-407E-A947-70E740481C1C}">
                           <a14:useLocalDpi xmlns:a14="http://schemas.microsoft.com/office/drawing/2010/main" val="0"/>
@@ -621,7 +601,7 @@
                     <pic:cNvPicPr/>
                   </pic:nvPicPr>
                   <pic:blipFill>
-                    <a:blip r:embed="rId12">
+                    <a:blip r:embed="rId13">
                       <a:extLst>
                         <a:ext uri="{28A0092B-C50C-407E-A947-70E740481C1C}">
                           <a14:useLocalDpi xmlns:a14="http://schemas.microsoft.com/office/drawing/2010/main" val="0"/>
@@ -677,64 +657,34 @@
         <w:rPr>
           <w:lang w:val="en-US"/>
         </w:rPr>
-        <w:t>Alias npp=’notepad++.exe -</w:t>
-      </w:r>
-      <w:proofErr w:type="spellStart"/>
-      <w:r>
-        <w:rPr>
-          <w:lang w:val="en-US"/>
-        </w:rPr>
-        <w:t>multiInst</w:t>
-      </w:r>
-      <w:proofErr w:type="spellEnd"/>
-      <w:r>
-        <w:rPr>
-          <w:lang w:val="en-US"/>
-        </w:rPr>
-        <w:t xml:space="preserve"> -</w:t>
-      </w:r>
-      <w:proofErr w:type="spellStart"/>
-      <w:r>
-        <w:rPr>
-          <w:lang w:val="en-US"/>
-        </w:rPr>
-        <w:t>nosession</w:t>
-      </w:r>
-      <w:proofErr w:type="spellEnd"/>
-      <w:r>
-        <w:rPr>
-          <w:lang w:val="en-US"/>
-        </w:rPr>
-        <w:t>’ in bash file.</w:t>
-      </w:r>
-    </w:p>
-    <w:p>
-      <w:pPr>
-        <w:rPr>
-          <w:lang w:val="en-US"/>
-        </w:rPr>
-      </w:pPr>
-    </w:p>
-    <w:p>
-      <w:pPr>
-        <w:rPr>
-          <w:lang w:val="en-US"/>
-        </w:rPr>
-      </w:pPr>
-      <w:r>
-        <w:rPr>
-          <w:lang w:val="en-US"/>
-        </w:rPr>
-        <w:t xml:space="preserve">Configured </w:t>
-      </w:r>
-      <w:proofErr w:type="gramStart"/>
-      <w:r>
-        <w:rPr>
-          <w:lang w:val="en-US"/>
-        </w:rPr>
-        <w:t>an</w:t>
-      </w:r>
-      <w:proofErr w:type="gramEnd"/>
+        <w:t>Alias npp=’notepad++.exe -multiInst -nosession’ in bash file.</w:t>
+      </w:r>
+    </w:p>
+    <w:p>
+      <w:pPr>
+        <w:rPr>
+          <w:lang w:val="en-US"/>
+        </w:rPr>
+      </w:pPr>
+    </w:p>
+    <w:p>
+      <w:pPr>
+        <w:rPr>
+          <w:lang w:val="en-US"/>
+        </w:rPr>
+      </w:pPr>
+      <w:r>
+        <w:rPr>
+          <w:lang w:val="en-US"/>
+        </w:rPr>
+        <w:t>Configured an</w:t>
+      </w:r>
+      <w:r>
+        <w:rPr>
+          <w:lang w:val="en-US"/>
+        </w:rPr>
+        <w:t>d</w:t>
+      </w:r>
       <w:r>
         <w:rPr>
           <w:lang w:val="en-US"/>
@@ -769,7 +719,7 @@
                     <pic:cNvPicPr/>
                   </pic:nvPicPr>
                   <pic:blipFill>
-                    <a:blip r:embed="rId13">
+                    <a:blip r:embed="rId14">
                       <a:extLst>
                         <a:ext uri="{28A0092B-C50C-407E-A947-70E740481C1C}">
                           <a14:useLocalDpi xmlns:a14="http://schemas.microsoft.com/office/drawing/2010/main" val="0"/>
@@ -816,7 +766,7 @@
                     <pic:cNvPicPr/>
                   </pic:nvPicPr>
                   <pic:blipFill>
-                    <a:blip r:embed="rId14">
+                    <a:blip r:embed="rId15">
                       <a:extLst>
                         <a:ext uri="{28A0092B-C50C-407E-A947-70E740481C1C}">
                           <a14:useLocalDpi xmlns:a14="http://schemas.microsoft.com/office/drawing/2010/main" val="0"/>
@@ -863,7 +813,7 @@
                     <pic:cNvPicPr/>
                   </pic:nvPicPr>
                   <pic:blipFill>
-                    <a:blip r:embed="rId15">
+                    <a:blip r:embed="rId16">
                       <a:extLst>
                         <a:ext uri="{28A0092B-C50C-407E-A947-70E740481C1C}">
                           <a14:useLocalDpi xmlns:a14="http://schemas.microsoft.com/office/drawing/2010/main" val="0"/>
@@ -952,7 +902,7 @@
                     <pic:cNvPicPr/>
                   </pic:nvPicPr>
                   <pic:blipFill>
-                    <a:blip r:embed="rId16">
+                    <a:blip r:embed="rId17">
                       <a:extLst>
                         <a:ext uri="{28A0092B-C50C-407E-A947-70E740481C1C}">
                           <a14:useLocalDpi xmlns:a14="http://schemas.microsoft.com/office/drawing/2010/main" val="0"/>
@@ -989,21 +939,7 @@
         <w:rPr>
           <w:lang w:val="en-US"/>
         </w:rPr>
-        <w:t xml:space="preserve">It was showing lot of files </w:t>
-      </w:r>
-      <w:proofErr w:type="spellStart"/>
-      <w:r>
-        <w:rPr>
-          <w:lang w:val="en-US"/>
-        </w:rPr>
-        <w:t>bcoz</w:t>
-      </w:r>
-      <w:proofErr w:type="spellEnd"/>
-      <w:r>
-        <w:rPr>
-          <w:lang w:val="en-US"/>
-        </w:rPr>
-        <w:t>, the I haven’t changed the directory to GitDemo, it was in parent directory to GitDemo.</w:t>
+        <w:t>It was showing lot of files bcoz, the I haven’t changed the directory to GitDemo, it was in parent directory to GitDemo.</w:t>
       </w:r>
     </w:p>
     <w:p>
@@ -1033,7 +969,7 @@
                     <pic:cNvPicPr/>
                   </pic:nvPicPr>
                   <pic:blipFill>
-                    <a:blip r:embed="rId17">
+                    <a:blip r:embed="rId18">
                       <a:extLst>
                         <a:ext uri="{28A0092B-C50C-407E-A947-70E740481C1C}">
                           <a14:useLocalDpi xmlns:a14="http://schemas.microsoft.com/office/drawing/2010/main" val="0"/>
@@ -1121,7 +1057,7 @@
                     <pic:cNvPicPr/>
                   </pic:nvPicPr>
                   <pic:blipFill>
-                    <a:blip r:embed="rId18">
+                    <a:blip r:embed="rId19">
                       <a:extLst>
                         <a:ext uri="{28A0092B-C50C-407E-A947-70E740481C1C}">
                           <a14:useLocalDpi xmlns:a14="http://schemas.microsoft.com/office/drawing/2010/main" val="0"/>
@@ -1195,7 +1131,7 @@
                     <pic:cNvPicPr/>
                   </pic:nvPicPr>
                   <pic:blipFill>
-                    <a:blip r:embed="rId19">
+                    <a:blip r:embed="rId20">
                       <a:extLst>
                         <a:ext uri="{28A0092B-C50C-407E-A947-70E740481C1C}">
                           <a14:useLocalDpi xmlns:a14="http://schemas.microsoft.com/office/drawing/2010/main" val="0"/>
@@ -1262,7 +1198,7 @@
                     <pic:cNvPicPr/>
                   </pic:nvPicPr>
                   <pic:blipFill>
-                    <a:blip r:embed="rId20">
+                    <a:blip r:embed="rId21">
                       <a:extLst>
                         <a:ext uri="{28A0092B-C50C-407E-A947-70E740481C1C}">
                           <a14:useLocalDpi xmlns:a14="http://schemas.microsoft.com/office/drawing/2010/main" val="0"/>
@@ -1379,7 +1315,7 @@
                     <pic:cNvPicPr/>
                   </pic:nvPicPr>
                   <pic:blipFill>
-                    <a:blip r:embed="rId21">
+                    <a:blip r:embed="rId22">
                       <a:extLst>
                         <a:ext uri="{28A0092B-C50C-407E-A947-70E740481C1C}">
                           <a14:useLocalDpi xmlns:a14="http://schemas.microsoft.com/office/drawing/2010/main" val="0"/>
@@ -1426,7 +1362,7 @@
                     <pic:cNvPicPr/>
                   </pic:nvPicPr>
                   <pic:blipFill>
-                    <a:blip r:embed="rId22">
+                    <a:blip r:embed="rId23">
                       <a:extLst>
                         <a:ext uri="{28A0092B-C50C-407E-A947-70E740481C1C}">
                           <a14:useLocalDpi xmlns:a14="http://schemas.microsoft.com/office/drawing/2010/main" val="0"/>
@@ -1493,7 +1429,7 @@
                     <pic:cNvPicPr/>
                   </pic:nvPicPr>
                   <pic:blipFill>
-                    <a:blip r:embed="rId23">
+                    <a:blip r:embed="rId24">
                       <a:extLst>
                         <a:ext uri="{28A0092B-C50C-407E-A947-70E740481C1C}">
                           <a14:useLocalDpi xmlns:a14="http://schemas.microsoft.com/office/drawing/2010/main" val="0"/>
@@ -1540,7 +1476,7 @@
                     <pic:cNvPicPr/>
                   </pic:nvPicPr>
                   <pic:blipFill>
-                    <a:blip r:embed="rId24">
+                    <a:blip r:embed="rId25">
                       <a:extLst>
                         <a:ext uri="{28A0092B-C50C-407E-A947-70E740481C1C}">
                           <a14:useLocalDpi xmlns:a14="http://schemas.microsoft.com/office/drawing/2010/main" val="0"/>
@@ -1657,7 +1593,7 @@
                     <pic:cNvPicPr/>
                   </pic:nvPicPr>
                   <pic:blipFill>
-                    <a:blip r:embed="rId25">
+                    <a:blip r:embed="rId26">
                       <a:extLst>
                         <a:ext uri="{28A0092B-C50C-407E-A947-70E740481C1C}">
                           <a14:useLocalDpi xmlns:a14="http://schemas.microsoft.com/office/drawing/2010/main" val="0"/>
@@ -1704,7 +1640,7 @@
                     <pic:cNvPicPr/>
                   </pic:nvPicPr>
                   <pic:blipFill>
-                    <a:blip r:embed="rId26">
+                    <a:blip r:embed="rId27">
                       <a:extLst>
                         <a:ext uri="{28A0092B-C50C-407E-A947-70E740481C1C}">
                           <a14:useLocalDpi xmlns:a14="http://schemas.microsoft.com/office/drawing/2010/main" val="0"/>
@@ -1748,21 +1684,7 @@
         <w:rPr>
           <w:lang w:val="en-US"/>
         </w:rPr>
-        <w:t xml:space="preserve">Linked the local repository to the Remote repository on </w:t>
-      </w:r>
-      <w:proofErr w:type="spellStart"/>
-      <w:r>
-        <w:rPr>
-          <w:lang w:val="en-US"/>
-        </w:rPr>
-        <w:t>gitlab</w:t>
-      </w:r>
-      <w:proofErr w:type="spellEnd"/>
-      <w:r>
-        <w:rPr>
-          <w:lang w:val="en-US"/>
-        </w:rPr>
-        <w:t xml:space="preserve"> using the https method.</w:t>
+        <w:t>Linked the local repository to the Remote repository on gitlab using the https method.</w:t>
       </w:r>
     </w:p>
     <w:p>
@@ -1792,7 +1714,7 @@
                     <pic:cNvPicPr/>
                   </pic:nvPicPr>
                   <pic:blipFill>
-                    <a:blip r:embed="rId27">
+                    <a:blip r:embed="rId28">
                       <a:extLst>
                         <a:ext uri="{28A0092B-C50C-407E-A947-70E740481C1C}">
                           <a14:useLocalDpi xmlns:a14="http://schemas.microsoft.com/office/drawing/2010/main" val="0"/>
@@ -1859,7 +1781,7 @@
                     <pic:cNvPicPr/>
                   </pic:nvPicPr>
                   <pic:blipFill>
-                    <a:blip r:embed="rId28">
+                    <a:blip r:embed="rId29">
                       <a:extLst>
                         <a:ext uri="{28A0092B-C50C-407E-A947-70E740481C1C}">
                           <a14:useLocalDpi xmlns:a14="http://schemas.microsoft.com/office/drawing/2010/main" val="0"/>
@@ -1909,21 +1831,7 @@
         <w:rPr>
           <w:lang w:val="en-US"/>
         </w:rPr>
-        <w:t xml:space="preserve">In </w:t>
-      </w:r>
-      <w:proofErr w:type="spellStart"/>
-      <w:r>
-        <w:rPr>
-          <w:lang w:val="en-US"/>
-        </w:rPr>
-        <w:t>gitlab</w:t>
-      </w:r>
-      <w:proofErr w:type="spellEnd"/>
-      <w:r>
-        <w:rPr>
-          <w:lang w:val="en-US"/>
-        </w:rPr>
-        <w:t xml:space="preserve"> it is main branch</w:t>
+        <w:t>In gitlab it is main branch</w:t>
       </w:r>
     </w:p>
     <w:p>
@@ -1978,7 +1886,7 @@
                     <pic:cNvPicPr/>
                   </pic:nvPicPr>
                   <pic:blipFill>
-                    <a:blip r:embed="rId29">
+                    <a:blip r:embed="rId30">
                       <a:extLst>
                         <a:ext uri="{28A0092B-C50C-407E-A947-70E740481C1C}">
                           <a14:useLocalDpi xmlns:a14="http://schemas.microsoft.com/office/drawing/2010/main" val="0"/>
@@ -2006,16 +1914,57 @@
       </w:r>
     </w:p>
     <w:p>
-      <w:pPr>
-        <w:rPr>
-          <w:lang w:val="en-US"/>
-        </w:rPr>
-      </w:pPr>
       <w:r>
         <w:rPr>
           <w:lang w:val="en-US"/>
         </w:rPr>
         <w:lastRenderedPageBreak/>
+        <w:t xml:space="preserve">Git fetch: </w:t>
+      </w:r>
+      <w:r>
+        <w:t xml:space="preserve">Fetches the main branch from the remote updating </w:t>
+      </w:r>
+      <w:r>
+        <w:t>the</w:t>
+      </w:r>
+      <w:r>
+        <w:t xml:space="preserve"> local re</w:t>
+      </w:r>
+      <w:r>
+        <w:t>po</w:t>
+      </w:r>
+      <w:r>
+        <w:t>.</w:t>
+      </w:r>
+    </w:p>
+    <w:p>
+      <w:r>
+        <w:t xml:space="preserve">Upstream: </w:t>
+      </w:r>
+      <w:r>
+        <w:t>T</w:t>
+      </w:r>
+      <w:r>
+        <w:t>ells Git that your local main branch should track origin/main.</w:t>
+      </w:r>
+    </w:p>
+    <w:p>
+      <w:pPr>
+        <w:rPr>
+          <w:lang w:val="en-US"/>
+        </w:rPr>
+      </w:pPr>
+    </w:p>
+    <w:p>
+      <w:pPr>
+        <w:rPr>
+          <w:lang w:val="en-US"/>
+        </w:rPr>
+      </w:pPr>
+      <w:r>
+        <w:rPr>
+          <w:lang w:val="en-US"/>
+        </w:rPr>
         <w:t>Pulled to local repo from remote repo</w:t>
       </w:r>
     </w:p>
@@ -2059,7 +2008,7 @@
                     <pic:cNvPicPr/>
                   </pic:nvPicPr>
                   <pic:blipFill>
-                    <a:blip r:embed="rId30">
+                    <a:blip r:embed="rId31">
                       <a:extLst>
                         <a:ext uri="{28A0092B-C50C-407E-A947-70E740481C1C}">
                           <a14:useLocalDpi xmlns:a14="http://schemas.microsoft.com/office/drawing/2010/main" val="0"/>
@@ -2126,7 +2075,7 @@
                     <pic:cNvPicPr/>
                   </pic:nvPicPr>
                   <pic:blipFill>
-                    <a:blip r:embed="rId31">
+                    <a:blip r:embed="rId32">
                       <a:extLst>
                         <a:ext uri="{28A0092B-C50C-407E-A947-70E740481C1C}">
                           <a14:useLocalDpi xmlns:a14="http://schemas.microsoft.com/office/drawing/2010/main" val="0"/>
@@ -2193,7 +2142,7 @@
                     <pic:cNvPicPr/>
                   </pic:nvPicPr>
                   <pic:blipFill>
-                    <a:blip r:embed="rId32">
+                    <a:blip r:embed="rId33">
                       <a:extLst>
                         <a:ext uri="{28A0092B-C50C-407E-A947-70E740481C1C}">
                           <a14:useLocalDpi xmlns:a14="http://schemas.microsoft.com/office/drawing/2010/main" val="0"/>
@@ -2230,21 +2179,8 @@
         <w:rPr>
           <w:lang w:val="en-US"/>
         </w:rPr>
-        <w:t xml:space="preserve">Finally pushed, from local repo to remote repo on </w:t>
-      </w:r>
-      <w:proofErr w:type="spellStart"/>
-      <w:r>
-        <w:rPr>
-          <w:lang w:val="en-US"/>
-        </w:rPr>
-        <w:t>gitlab</w:t>
-      </w:r>
-      <w:proofErr w:type="spellEnd"/>
-      <w:r>
-        <w:rPr>
-          <w:lang w:val="en-US"/>
-        </w:rPr>
-        <w:t>.</w:t>
+        <w:lastRenderedPageBreak/>
+        <w:t>Finally pushed, from local repo to remote repo on gitlab.</w:t>
       </w:r>
       <w:r>
         <w:rPr>
@@ -2267,7 +2203,7 @@
                     <pic:cNvPicPr/>
                   </pic:nvPicPr>
                   <pic:blipFill>
-                    <a:blip r:embed="rId33"/>
+                    <a:blip r:embed="rId34"/>
                     <a:stretch>
                       <a:fillRect/>
                     </a:stretch>
@@ -2308,7 +2244,7 @@
                     <pic:cNvPicPr/>
                   </pic:nvPicPr>
                   <pic:blipFill>
-                    <a:blip r:embed="rId34">
+                    <a:blip r:embed="rId35">
                       <a:extLst>
                         <a:ext uri="{28A0092B-C50C-407E-A947-70E740481C1C}">
                           <a14:useLocalDpi xmlns:a14="http://schemas.microsoft.com/office/drawing/2010/main" val="0"/>
@@ -2352,17 +2288,8 @@
         <w:rPr>
           <w:lang w:val="en-US"/>
         </w:rPr>
-        <w:lastRenderedPageBreak/>
-        <w:t xml:space="preserve">Welcome.txt got pushed into the GitDemo project in </w:t>
-      </w:r>
-      <w:proofErr w:type="spellStart"/>
-      <w:r>
-        <w:rPr>
-          <w:lang w:val="en-US"/>
-        </w:rPr>
-        <w:t>gitlab</w:t>
-      </w:r>
-      <w:proofErr w:type="spellEnd"/>
+        <w:t>Welcome.txt got pushed into the GitDemo project in gitlab</w:t>
+      </w:r>
     </w:p>
     <w:p>
       <w:pPr>
@@ -2391,7 +2318,7 @@
                     <pic:cNvPicPr/>
                   </pic:nvPicPr>
                   <pic:blipFill>
-                    <a:blip r:embed="rId35" cstate="print">
+                    <a:blip r:embed="rId36" cstate="print">
                       <a:extLst>
                         <a:ext uri="{28A0092B-C50C-407E-A947-70E740481C1C}">
                           <a14:useLocalDpi xmlns:a14="http://schemas.microsoft.com/office/drawing/2010/main" val="0"/>
@@ -2458,7 +2385,7 @@
                     <pic:cNvPicPr/>
                   </pic:nvPicPr>
                   <pic:blipFill>
-                    <a:blip r:embed="rId36">
+                    <a:blip r:embed="rId37">
                       <a:extLst>
                         <a:ext uri="{28A0092B-C50C-407E-A947-70E740481C1C}">
                           <a14:useLocalDpi xmlns:a14="http://schemas.microsoft.com/office/drawing/2010/main" val="0"/>
@@ -2485,6 +2412,798 @@
         </w:drawing>
       </w:r>
     </w:p>
+    <w:p>
+      <w:pPr>
+        <w:rPr>
+          <w:lang w:val="en-US"/>
+        </w:rPr>
+      </w:pPr>
+    </w:p>
+    <w:p>
+      <w:pPr>
+        <w:rPr>
+          <w:lang w:val="en-US"/>
+        </w:rPr>
+      </w:pPr>
+    </w:p>
+    <w:p>
+      <w:pPr>
+        <w:rPr>
+          <w:b/>
+          <w:bCs/>
+          <w:u w:val="single"/>
+          <w:lang w:val="en-US"/>
+        </w:rPr>
+      </w:pPr>
+      <w:r>
+        <w:rPr>
+          <w:b/>
+          <w:bCs/>
+          <w:u w:val="single"/>
+          <w:lang w:val="en-US"/>
+        </w:rPr>
+        <w:lastRenderedPageBreak/>
+        <w:t>multiInst and nosession ensures that always a new notepad++ file opens without restoring previous files to not interefere with any on-going/previous commits</w:t>
+      </w:r>
+      <w:r>
+        <w:rPr>
+          <w:b/>
+          <w:bCs/>
+          <w:u w:val="single"/>
+          <w:lang w:val="en-US"/>
+        </w:rPr>
+        <w:t>.</w:t>
+      </w:r>
+    </w:p>
+    <w:p>
+      <w:pPr>
+        <w:rPr>
+          <w:lang w:val="en-US"/>
+        </w:rPr>
+      </w:pPr>
+    </w:p>
+    <w:p>
+      <w:pPr>
+        <w:rPr>
+          <w:b/>
+          <w:bCs/>
+          <w:u w:val="single"/>
+          <w:lang w:val="en-US"/>
+        </w:rPr>
+      </w:pPr>
+      <w:r>
+        <w:rPr>
+          <w:b/>
+          <w:bCs/>
+          <w:u w:val="single"/>
+          <w:lang w:val="en-US"/>
+        </w:rPr>
+        <w:t>MISTAKES DONE EARLIER:</w:t>
+      </w:r>
+    </w:p>
+    <w:p>
+      <w:pPr>
+        <w:rPr>
+          <w:lang w:val="en-US"/>
+        </w:rPr>
+      </w:pPr>
+      <w:r>
+        <w:rPr>
+          <w:noProof/>
+          <w:lang w:val="en-US"/>
+        </w:rPr>
+        <w:drawing>
+          <wp:inline distT="0" distB="0" distL="0" distR="0" wp14:anchorId="2E34622E" wp14:editId="21F4E026">
+            <wp:extent cx="5731510" cy="3766457"/>
+            <wp:effectExtent l="0" t="0" r="2540" b="5715"/>
+            <wp:docPr id="1524204240" name="Picture 2"/>
+            <wp:cNvGraphicFramePr>
+              <a:graphicFrameLocks xmlns:a="http://schemas.openxmlformats.org/drawingml/2006/main" noChangeAspect="1"/>
+            </wp:cNvGraphicFramePr>
+            <a:graphic xmlns:a="http://schemas.openxmlformats.org/drawingml/2006/main">
+              <a:graphicData uri="http://schemas.openxmlformats.org/drawingml/2006/picture">
+                <pic:pic xmlns:pic="http://schemas.openxmlformats.org/drawingml/2006/picture">
+                  <pic:nvPicPr>
+                    <pic:cNvPr id="1524204240" name="Picture 1524204240"/>
+                    <pic:cNvPicPr/>
+                  </pic:nvPicPr>
+                  <pic:blipFill>
+                    <a:blip r:embed="rId38">
+                      <a:extLst>
+                        <a:ext uri="{28A0092B-C50C-407E-A947-70E740481C1C}">
+                          <a14:useLocalDpi xmlns:a14="http://schemas.microsoft.com/office/drawing/2010/main" val="0"/>
+                        </a:ext>
+                      </a:extLst>
+                    </a:blip>
+                    <a:stretch>
+                      <a:fillRect/>
+                    </a:stretch>
+                  </pic:blipFill>
+                  <pic:spPr>
+                    <a:xfrm>
+                      <a:off x="0" y="0"/>
+                      <a:ext cx="5734923" cy="3768700"/>
+                    </a:xfrm>
+                    <a:prstGeom prst="rect">
+                      <a:avLst/>
+                    </a:prstGeom>
+                  </pic:spPr>
+                </pic:pic>
+              </a:graphicData>
+            </a:graphic>
+          </wp:inline>
+        </w:drawing>
+      </w:r>
+    </w:p>
+    <w:p>
+      <w:pPr>
+        <w:pStyle w:val="ListParagraph"/>
+        <w:numPr>
+          <w:ilvl w:val="0"/>
+          <w:numId w:val="1"/>
+        </w:numPr>
+        <w:rPr>
+          <w:b/>
+          <w:bCs/>
+          <w:u w:val="single"/>
+          <w:lang w:val="en-US"/>
+        </w:rPr>
+      </w:pPr>
+      <w:r>
+        <w:rPr>
+          <w:b/>
+          <w:bCs/>
+          <w:u w:val="single"/>
+          <w:lang w:val="en-US"/>
+        </w:rPr>
+        <w:t>These steps failed to create an alias named npp to open notepad++.</w:t>
+      </w:r>
+    </w:p>
+    <w:p>
+      <w:pPr>
+        <w:pStyle w:val="ListParagraph"/>
+        <w:numPr>
+          <w:ilvl w:val="0"/>
+          <w:numId w:val="1"/>
+        </w:numPr>
+        <w:rPr>
+          <w:lang w:val="en-US"/>
+        </w:rPr>
+      </w:pPr>
+      <w:r>
+        <w:rPr>
+          <w:lang w:val="en-US"/>
+        </w:rPr>
+        <w:t xml:space="preserve">It created a file named bash, and added alias statement, that </w:t>
+      </w:r>
+      <w:r>
+        <w:rPr>
+          <w:lang w:val="en-US"/>
+        </w:rPr>
+        <w:t>doesn’t create a alias</w:t>
+      </w:r>
+    </w:p>
+    <w:p>
+      <w:pPr>
+        <w:pStyle w:val="ListParagraph"/>
+        <w:numPr>
+          <w:ilvl w:val="0"/>
+          <w:numId w:val="1"/>
+        </w:numPr>
+        <w:rPr>
+          <w:lang w:val="en-US"/>
+        </w:rPr>
+      </w:pPr>
+      <w:r>
+        <w:rPr>
+          <w:lang w:val="en-US"/>
+        </w:rPr>
+        <w:t>Typically, alias are written in .bashrc, .bash_profile files in home directory as they are automatically sourced (loaded automatically) when git bash starts and aliases can be used.</w:t>
+      </w:r>
+    </w:p>
+    <w:p>
+      <w:pPr>
+        <w:pStyle w:val="ListParagraph"/>
+        <w:numPr>
+          <w:ilvl w:val="0"/>
+          <w:numId w:val="1"/>
+        </w:numPr>
+        <w:rPr>
+          <w:lang w:val="en-US"/>
+        </w:rPr>
+      </w:pPr>
+      <w:r>
+        <w:rPr>
+          <w:lang w:val="en-US"/>
+        </w:rPr>
+        <w:t>Bash file will not be loaded automatically hence, aliases are not added.</w:t>
+      </w:r>
+    </w:p>
+    <w:p>
+      <w:pPr>
+        <w:rPr>
+          <w:b/>
+          <w:bCs/>
+          <w:u w:val="single"/>
+          <w:lang w:val="en-US"/>
+        </w:rPr>
+      </w:pPr>
+      <w:r>
+        <w:rPr>
+          <w:b/>
+          <w:bCs/>
+          <w:u w:val="single"/>
+          <w:lang w:val="en-US"/>
+        </w:rPr>
+        <w:t>.basrc vs .bash_profile:</w:t>
+      </w:r>
+    </w:p>
+    <w:p>
+      <w:pPr>
+        <w:rPr>
+          <w:b/>
+          <w:bCs/>
+          <w:u w:val="single"/>
+          <w:lang w:val="en-US"/>
+        </w:rPr>
+      </w:pPr>
+      <w:r>
+        <w:rPr>
+          <w:b/>
+          <w:bCs/>
+          <w:u w:val="single"/>
+          <w:lang w:val="en-US"/>
+        </w:rPr>
+        <w:t>.bashrc:</w:t>
+      </w:r>
+    </w:p>
+    <w:p>
+      <w:pPr>
+        <w:pStyle w:val="ListParagraph"/>
+        <w:numPr>
+          <w:ilvl w:val="0"/>
+          <w:numId w:val="2"/>
+        </w:numPr>
+        <w:rPr>
+          <w:b/>
+          <w:bCs/>
+          <w:u w:val="single"/>
+          <w:lang w:val="en-US"/>
+        </w:rPr>
+      </w:pPr>
+      <w:r>
+        <w:rPr>
+          <w:lang w:val="en-US"/>
+        </w:rPr>
+        <w:t>Used for interactive non-login shells, it runs every time we open git bash or a new terminal tab.</w:t>
+      </w:r>
+    </w:p>
+    <w:p>
+      <w:pPr>
+        <w:rPr>
+          <w:b/>
+          <w:bCs/>
+          <w:u w:val="single"/>
+          <w:lang w:val="en-US"/>
+        </w:rPr>
+      </w:pPr>
+      <w:r>
+        <w:rPr>
+          <w:b/>
+          <w:bCs/>
+          <w:u w:val="single"/>
+          <w:lang w:val="en-US"/>
+        </w:rPr>
+        <w:t>.bash_profile</w:t>
+      </w:r>
+      <w:r>
+        <w:rPr>
+          <w:b/>
+          <w:bCs/>
+          <w:u w:val="single"/>
+          <w:lang w:val="en-US"/>
+        </w:rPr>
+        <w:t>:</w:t>
+      </w:r>
+    </w:p>
+    <w:p>
+      <w:pPr>
+        <w:pStyle w:val="ListParagraph"/>
+        <w:numPr>
+          <w:ilvl w:val="0"/>
+          <w:numId w:val="3"/>
+        </w:numPr>
+        <w:rPr>
+          <w:b/>
+          <w:bCs/>
+          <w:u w:val="single"/>
+          <w:lang w:val="en-US"/>
+        </w:rPr>
+      </w:pPr>
+      <w:r>
+        <w:rPr>
+          <w:lang w:val="en-US"/>
+        </w:rPr>
+        <w:t>Used for login shells, it runs only when we log in.</w:t>
+      </w:r>
+    </w:p>
+    <w:p>
+      <w:pPr>
+        <w:pStyle w:val="ListParagraph"/>
+        <w:numPr>
+          <w:ilvl w:val="0"/>
+          <w:numId w:val="3"/>
+        </w:numPr>
+        <w:rPr>
+          <w:b/>
+          <w:bCs/>
+          <w:u w:val="single"/>
+          <w:lang w:val="en-US"/>
+        </w:rPr>
+      </w:pPr>
+      <w:r>
+        <w:rPr>
+          <w:lang w:val="en-US"/>
+        </w:rPr>
+        <w:t>So generally, we add a command in .bash_profile, to source .bashrc bcoz to load aliases even in log in shell.</w:t>
+      </w:r>
+    </w:p>
+    <w:p>
+      <w:pPr>
+        <w:rPr>
+          <w:b/>
+          <w:bCs/>
+          <w:u w:val="single"/>
+          <w:lang w:val="en-US"/>
+        </w:rPr>
+      </w:pPr>
+      <w:r>
+        <w:rPr>
+          <w:b/>
+          <w:bCs/>
+          <w:u w:val="single"/>
+          <w:lang w:val="en-US"/>
+        </w:rPr>
+        <w:lastRenderedPageBreak/>
+        <w:t>But in gitbash</w:t>
+      </w:r>
+      <w:r>
+        <w:rPr>
+          <w:b/>
+          <w:bCs/>
+          <w:u w:val="single"/>
+          <w:lang w:val="en-US"/>
+        </w:rPr>
+        <w:t xml:space="preserve"> windows</w:t>
+      </w:r>
+      <w:r>
+        <w:rPr>
+          <w:b/>
+          <w:bCs/>
+          <w:u w:val="single"/>
+          <w:lang w:val="en-US"/>
+        </w:rPr>
+        <w:t>, .basrc usually loads even if it is a login shell</w:t>
+      </w:r>
+      <w:r>
+        <w:rPr>
+          <w:b/>
+          <w:bCs/>
+          <w:u w:val="single"/>
+          <w:lang w:val="en-US"/>
+        </w:rPr>
+        <w:t>, i.e .bash_profile is ignored.</w:t>
+      </w:r>
+    </w:p>
+    <w:p>
+      <w:pPr>
+        <w:rPr>
+          <w:b/>
+          <w:bCs/>
+          <w:u w:val="single"/>
+          <w:lang w:val="en-US"/>
+        </w:rPr>
+      </w:pPr>
+      <w:r>
+        <w:rPr>
+          <w:b/>
+          <w:bCs/>
+          <w:u w:val="single"/>
+          <w:lang w:val="en-US"/>
+        </w:rPr>
+        <w:t>Hence, final correct code/images:</w:t>
+      </w:r>
+    </w:p>
+    <w:p>
+      <w:pPr>
+        <w:rPr>
+          <w:lang w:val="en-US"/>
+        </w:rPr>
+      </w:pPr>
+      <w:r>
+        <w:rPr>
+          <w:lang w:val="en-US"/>
+        </w:rPr>
+        <w:t>Where I found npp command was not working.</w:t>
+      </w:r>
+    </w:p>
+    <w:p>
+      <w:pPr>
+        <w:rPr>
+          <w:lang w:val="en-US"/>
+        </w:rPr>
+      </w:pPr>
+      <w:r>
+        <w:rPr>
+          <w:lang w:val="en-US"/>
+        </w:rPr>
+        <w:t xml:space="preserve">And </w:t>
+      </w:r>
+      <w:r>
+        <w:rPr>
+          <w:lang w:val="en-US"/>
+        </w:rPr>
+        <w:t xml:space="preserve">created a </w:t>
+      </w:r>
+      <w:r>
+        <w:rPr>
+          <w:lang w:val="en-US"/>
+        </w:rPr>
+        <w:t>bashrc file</w:t>
+      </w:r>
+    </w:p>
+    <w:p>
+      <w:pPr>
+        <w:rPr>
+          <w:b/>
+          <w:bCs/>
+          <w:u w:val="single"/>
+          <w:lang w:val="en-US"/>
+        </w:rPr>
+      </w:pPr>
+      <w:r>
+        <w:rPr>
+          <w:b/>
+          <w:bCs/>
+          <w:noProof/>
+          <w:u w:val="single"/>
+          <w:lang w:val="en-US"/>
+        </w:rPr>
+        <w:drawing>
+          <wp:inline distT="0" distB="0" distL="0" distR="0" wp14:anchorId="506CE84D" wp14:editId="33C6DF84">
+            <wp:extent cx="4095750" cy="1654629"/>
+            <wp:effectExtent l="0" t="0" r="0" b="3175"/>
+            <wp:docPr id="1576317204" name="Picture 3"/>
+            <wp:cNvGraphicFramePr>
+              <a:graphicFrameLocks xmlns:a="http://schemas.openxmlformats.org/drawingml/2006/main" noChangeAspect="1"/>
+            </wp:cNvGraphicFramePr>
+            <a:graphic xmlns:a="http://schemas.openxmlformats.org/drawingml/2006/main">
+              <a:graphicData uri="http://schemas.openxmlformats.org/drawingml/2006/picture">
+                <pic:pic xmlns:pic="http://schemas.openxmlformats.org/drawingml/2006/picture">
+                  <pic:nvPicPr>
+                    <pic:cNvPr id="1576317204" name="Picture 1576317204"/>
+                    <pic:cNvPicPr/>
+                  </pic:nvPicPr>
+                  <pic:blipFill>
+                    <a:blip r:embed="rId39">
+                      <a:extLst>
+                        <a:ext uri="{28A0092B-C50C-407E-A947-70E740481C1C}">
+                          <a14:useLocalDpi xmlns:a14="http://schemas.microsoft.com/office/drawing/2010/main" val="0"/>
+                        </a:ext>
+                      </a:extLst>
+                    </a:blip>
+                    <a:stretch>
+                      <a:fillRect/>
+                    </a:stretch>
+                  </pic:blipFill>
+                  <pic:spPr>
+                    <a:xfrm>
+                      <a:off x="0" y="0"/>
+                      <a:ext cx="4102037" cy="1657169"/>
+                    </a:xfrm>
+                    <a:prstGeom prst="rect">
+                      <a:avLst/>
+                    </a:prstGeom>
+                  </pic:spPr>
+                </pic:pic>
+              </a:graphicData>
+            </a:graphic>
+          </wp:inline>
+        </w:drawing>
+      </w:r>
+    </w:p>
+    <w:p>
+      <w:pPr>
+        <w:rPr>
+          <w:b/>
+          <w:bCs/>
+          <w:u w:val="single"/>
+          <w:lang w:val="en-US"/>
+        </w:rPr>
+      </w:pPr>
+      <w:r>
+        <w:rPr>
+          <w:b/>
+          <w:bCs/>
+          <w:noProof/>
+          <w:u w:val="single"/>
+          <w:lang w:val="en-US"/>
+        </w:rPr>
+        <w:drawing>
+          <wp:inline distT="0" distB="0" distL="0" distR="0" wp14:anchorId="39CD33FB" wp14:editId="2747C046">
+            <wp:extent cx="3264880" cy="1426029"/>
+            <wp:effectExtent l="0" t="0" r="0" b="3175"/>
+            <wp:docPr id="1797194288" name="Picture 4"/>
+            <wp:cNvGraphicFramePr>
+              <a:graphicFrameLocks xmlns:a="http://schemas.openxmlformats.org/drawingml/2006/main" noChangeAspect="1"/>
+            </wp:cNvGraphicFramePr>
+            <a:graphic xmlns:a="http://schemas.openxmlformats.org/drawingml/2006/main">
+              <a:graphicData uri="http://schemas.openxmlformats.org/drawingml/2006/picture">
+                <pic:pic xmlns:pic="http://schemas.openxmlformats.org/drawingml/2006/picture">
+                  <pic:nvPicPr>
+                    <pic:cNvPr id="1797194288" name="Picture 1797194288"/>
+                    <pic:cNvPicPr/>
+                  </pic:nvPicPr>
+                  <pic:blipFill>
+                    <a:blip r:embed="rId40">
+                      <a:extLst>
+                        <a:ext uri="{28A0092B-C50C-407E-A947-70E740481C1C}">
+                          <a14:useLocalDpi xmlns:a14="http://schemas.microsoft.com/office/drawing/2010/main" val="0"/>
+                        </a:ext>
+                      </a:extLst>
+                    </a:blip>
+                    <a:stretch>
+                      <a:fillRect/>
+                    </a:stretch>
+                  </pic:blipFill>
+                  <pic:spPr>
+                    <a:xfrm>
+                      <a:off x="0" y="0"/>
+                      <a:ext cx="3288428" cy="1436314"/>
+                    </a:xfrm>
+                    <a:prstGeom prst="rect">
+                      <a:avLst/>
+                    </a:prstGeom>
+                  </pic:spPr>
+                </pic:pic>
+              </a:graphicData>
+            </a:graphic>
+          </wp:inline>
+        </w:drawing>
+      </w:r>
+    </w:p>
+    <w:p>
+      <w:pPr>
+        <w:rPr>
+          <w:lang w:val="en-US"/>
+        </w:rPr>
+      </w:pPr>
+      <w:r>
+        <w:rPr>
+          <w:lang w:val="en-US"/>
+        </w:rPr>
+        <w:t>Created an alias</w:t>
+      </w:r>
+    </w:p>
+    <w:p>
+      <w:pPr>
+        <w:rPr>
+          <w:b/>
+          <w:bCs/>
+          <w:u w:val="single"/>
+          <w:lang w:val="en-US"/>
+        </w:rPr>
+      </w:pPr>
+      <w:r>
+        <w:rPr>
+          <w:b/>
+          <w:bCs/>
+          <w:noProof/>
+          <w:u w:val="single"/>
+          <w:lang w:val="en-US"/>
+        </w:rPr>
+        <w:drawing>
+          <wp:inline distT="0" distB="0" distL="0" distR="0" wp14:anchorId="735FEC70" wp14:editId="63422839">
+            <wp:extent cx="5731510" cy="1167311"/>
+            <wp:effectExtent l="0" t="0" r="2540" b="0"/>
+            <wp:docPr id="1331504384" name="Picture 5"/>
+            <wp:cNvGraphicFramePr>
+              <a:graphicFrameLocks xmlns:a="http://schemas.openxmlformats.org/drawingml/2006/main" noChangeAspect="1"/>
+            </wp:cNvGraphicFramePr>
+            <a:graphic xmlns:a="http://schemas.openxmlformats.org/drawingml/2006/main">
+              <a:graphicData uri="http://schemas.openxmlformats.org/drawingml/2006/picture">
+                <pic:pic xmlns:pic="http://schemas.openxmlformats.org/drawingml/2006/picture">
+                  <pic:nvPicPr>
+                    <pic:cNvPr id="1331504384" name="Picture 1331504384"/>
+                    <pic:cNvPicPr/>
+                  </pic:nvPicPr>
+                  <pic:blipFill>
+                    <a:blip r:embed="rId41">
+                      <a:extLst>
+                        <a:ext uri="{28A0092B-C50C-407E-A947-70E740481C1C}">
+                          <a14:useLocalDpi xmlns:a14="http://schemas.microsoft.com/office/drawing/2010/main" val="0"/>
+                        </a:ext>
+                      </a:extLst>
+                    </a:blip>
+                    <a:stretch>
+                      <a:fillRect/>
+                    </a:stretch>
+                  </pic:blipFill>
+                  <pic:spPr>
+                    <a:xfrm>
+                      <a:off x="0" y="0"/>
+                      <a:ext cx="5743379" cy="1169728"/>
+                    </a:xfrm>
+                    <a:prstGeom prst="rect">
+                      <a:avLst/>
+                    </a:prstGeom>
+                  </pic:spPr>
+                </pic:pic>
+              </a:graphicData>
+            </a:graphic>
+          </wp:inline>
+        </w:drawing>
+      </w:r>
+    </w:p>
+    <w:p>
+      <w:pPr>
+        <w:rPr>
+          <w:b/>
+          <w:bCs/>
+          <w:u w:val="single"/>
+          <w:lang w:val="en-US"/>
+        </w:rPr>
+      </w:pPr>
+      <w:r>
+        <w:rPr>
+          <w:b/>
+          <w:bCs/>
+          <w:u w:val="single"/>
+          <w:lang w:val="en-US"/>
+        </w:rPr>
+        <w:t>Verified using npp command</w:t>
+      </w:r>
+    </w:p>
+    <w:p>
+      <w:pPr>
+        <w:rPr>
+          <w:b/>
+          <w:bCs/>
+          <w:u w:val="single"/>
+          <w:lang w:val="en-US"/>
+        </w:rPr>
+      </w:pPr>
+      <w:r>
+        <w:rPr>
+          <w:b/>
+          <w:bCs/>
+          <w:noProof/>
+          <w:u w:val="single"/>
+          <w:lang w:val="en-US"/>
+        </w:rPr>
+        <w:drawing>
+          <wp:inline distT="0" distB="0" distL="0" distR="0" wp14:anchorId="7BB23D01" wp14:editId="5AC19BA9">
+            <wp:extent cx="2619374" cy="707571"/>
+            <wp:effectExtent l="0" t="0" r="0" b="0"/>
+            <wp:docPr id="1945685064" name="Picture 6"/>
+            <wp:cNvGraphicFramePr>
+              <a:graphicFrameLocks xmlns:a="http://schemas.openxmlformats.org/drawingml/2006/main" noChangeAspect="1"/>
+            </wp:cNvGraphicFramePr>
+            <a:graphic xmlns:a="http://schemas.openxmlformats.org/drawingml/2006/main">
+              <a:graphicData uri="http://schemas.openxmlformats.org/drawingml/2006/picture">
+                <pic:pic xmlns:pic="http://schemas.openxmlformats.org/drawingml/2006/picture">
+                  <pic:nvPicPr>
+                    <pic:cNvPr id="1945685064" name="Picture 1945685064"/>
+                    <pic:cNvPicPr/>
+                  </pic:nvPicPr>
+                  <pic:blipFill>
+                    <a:blip r:embed="rId42">
+                      <a:extLst>
+                        <a:ext uri="{28A0092B-C50C-407E-A947-70E740481C1C}">
+                          <a14:useLocalDpi xmlns:a14="http://schemas.microsoft.com/office/drawing/2010/main" val="0"/>
+                        </a:ext>
+                      </a:extLst>
+                    </a:blip>
+                    <a:stretch>
+                      <a:fillRect/>
+                    </a:stretch>
+                  </pic:blipFill>
+                  <pic:spPr>
+                    <a:xfrm>
+                      <a:off x="0" y="0"/>
+                      <a:ext cx="2630849" cy="710671"/>
+                    </a:xfrm>
+                    <a:prstGeom prst="rect">
+                      <a:avLst/>
+                    </a:prstGeom>
+                  </pic:spPr>
+                </pic:pic>
+              </a:graphicData>
+            </a:graphic>
+          </wp:inline>
+        </w:drawing>
+      </w:r>
+    </w:p>
+    <w:p>
+      <w:pPr>
+        <w:rPr>
+          <w:b/>
+          <w:bCs/>
+          <w:u w:val="single"/>
+          <w:lang w:val="en-US"/>
+        </w:rPr>
+      </w:pPr>
+      <w:r>
+        <w:rPr>
+          <w:b/>
+          <w:bCs/>
+          <w:u w:val="single"/>
+          <w:lang w:val="en-US"/>
+        </w:rPr>
+        <w:t>Opened a notepad++ file.</w:t>
+      </w:r>
+    </w:p>
+    <w:p>
+      <w:pPr>
+        <w:rPr>
+          <w:b/>
+          <w:bCs/>
+          <w:u w:val="single"/>
+          <w:lang w:val="en-US"/>
+        </w:rPr>
+      </w:pPr>
+      <w:r>
+        <w:rPr>
+          <w:b/>
+          <w:bCs/>
+          <w:noProof/>
+          <w:u w:val="single"/>
+          <w:lang w:val="en-US"/>
+        </w:rPr>
+        <w:lastRenderedPageBreak/>
+        <w:drawing>
+          <wp:inline distT="0" distB="0" distL="0" distR="0" wp14:anchorId="0A0397E4" wp14:editId="276DC460">
+            <wp:extent cx="5726488" cy="1545771"/>
+            <wp:effectExtent l="0" t="0" r="7620" b="0"/>
+            <wp:docPr id="1204891515" name="Picture 7"/>
+            <wp:cNvGraphicFramePr>
+              <a:graphicFrameLocks xmlns:a="http://schemas.openxmlformats.org/drawingml/2006/main" noChangeAspect="1"/>
+            </wp:cNvGraphicFramePr>
+            <a:graphic xmlns:a="http://schemas.openxmlformats.org/drawingml/2006/main">
+              <a:graphicData uri="http://schemas.openxmlformats.org/drawingml/2006/picture">
+                <pic:pic xmlns:pic="http://schemas.openxmlformats.org/drawingml/2006/picture">
+                  <pic:nvPicPr>
+                    <pic:cNvPr id="1204891515" name="Picture 1204891515"/>
+                    <pic:cNvPicPr/>
+                  </pic:nvPicPr>
+                  <pic:blipFill>
+                    <a:blip r:embed="rId43">
+                      <a:extLst>
+                        <a:ext uri="{28A0092B-C50C-407E-A947-70E740481C1C}">
+                          <a14:useLocalDpi xmlns:a14="http://schemas.microsoft.com/office/drawing/2010/main" val="0"/>
+                        </a:ext>
+                      </a:extLst>
+                    </a:blip>
+                    <a:stretch>
+                      <a:fillRect/>
+                    </a:stretch>
+                  </pic:blipFill>
+                  <pic:spPr>
+                    <a:xfrm>
+                      <a:off x="0" y="0"/>
+                      <a:ext cx="5822986" cy="1571819"/>
+                    </a:xfrm>
+                    <a:prstGeom prst="rect">
+                      <a:avLst/>
+                    </a:prstGeom>
+                  </pic:spPr>
+                </pic:pic>
+              </a:graphicData>
+            </a:graphic>
+          </wp:inline>
+        </w:drawing>
+      </w:r>
+    </w:p>
     <w:sectPr>
       <w:pgSz w:w="11906" w:h="16838"/>
       <w:pgMar w:top="1440" w:right="1440" w:bottom="1440" w:left="1440" w:header="708" w:footer="708" w:gutter="0"/>
@@ -2493,6 +3212,287 @@
     </w:sectPr>
   </w:body>
 </w:document>
+</file>
+
+<file path=word/numbering.xml><?xml version="1.0" encoding="utf-8"?>
+<w:numbering xmlns:wpc="http://schemas.microsoft.com/office/word/2010/wordprocessingCanvas" xmlns:cx="http://schemas.microsoft.com/office/drawing/2014/chartex" xmlns:cx1="http://schemas.microsoft.com/office/drawing/2015/9/8/chartex" xmlns:cx2="http://schemas.microsoft.com/office/drawing/2015/10/21/chartex" xmlns:cx3="http://schemas.microsoft.com/office/drawing/2016/5/9/chartex" xmlns:cx4="http://schemas.microsoft.com/office/drawing/2016/5/10/chartex" xmlns:cx5="http://schemas.microsoft.com/office/drawing/2016/5/11/chartex" xmlns:cx6="http://schemas.microsoft.com/office/drawing/2016/5/12/chartex" xmlns:cx7="http://schemas.microsoft.com/office/drawing/2016/5/13/chartex" xmlns:cx8="http://schemas.microsoft.com/office/drawing/2016/5/14/chartex" xmlns:mc="http://schemas.openxmlformats.org/markup-compatibility/2006" xmlns:aink="http://schemas.microsoft.com/office/drawing/2016/ink" xmlns:am3d="http://schemas.microsoft.com/office/drawing/2017/model3d" xmlns:o="urn:schemas-microsoft-com:office:office" xmlns:oel="http://schemas.microsoft.com/office/2019/extlst" xmlns:r="http://schemas.openxmlformats.org/officeDocument/2006/relationships" xmlns:m="http://schemas.openxmlformats.org/officeDocument/2006/math" xmlns:v="urn:schemas-microsoft-com:vml" xmlns:wp14="http://schemas.microsoft.com/office/word/2010/wordprocessingDrawing" xmlns:wp="http://schemas.openxmlformats.org/drawingml/2006/wordprocessingDrawing" xmlns:w10="urn:schemas-microsoft-com:office:word" xmlns:w="http://schemas.openxmlformats.org/wordprocessingml/2006/main" xmlns:w14="http://schemas.microsoft.com/office/word/2010/wordml" xmlns:w15="http://schemas.microsoft.com/office/word/2012/wordml" xmlns:w16cex="http://schemas.microsoft.com/office/word/2018/wordml/cex" xmlns:w16cid="http://schemas.microsoft.com/office/word/2016/wordml/cid" xmlns:w16="http://schemas.microsoft.com/office/word/2018/wordml" xmlns:w16du="http://schemas.microsoft.com/office/word/2023/wordml/word16du" xmlns:w16sdtdh="http://schemas.microsoft.com/office/word/2020/wordml/sdtdatahash" xmlns:w16sdtfl="http://schemas.microsoft.com/office/word/2024/wordml/sdtformatlock" xmlns:w16se="http://schemas.microsoft.com/office/word/2015/wordml/symex" xmlns:wpg="http://schemas.microsoft.com/office/word/2010/wordprocessingGroup" xmlns:wpi="http://schemas.microsoft.com/office/word/2010/wordprocessingInk" xmlns:wne="http://schemas.microsoft.com/office/word/2006/wordml" xmlns:wps="http://schemas.microsoft.com/office/word/2010/wordprocessingShape" mc:Ignorable="w14 w15 w16se w16cid w16 w16cex w16sdtdh w16sdtfl w16du wp14">
+  <w:abstractNum w:abstractNumId="0" w15:restartNumberingAfterBreak="0">
+    <w:nsid w:val="1E8229FF"/>
+    <w:multiLevelType w:val="hybridMultilevel"/>
+    <w:tmpl w:val="0498A6FC"/>
+    <w:lvl w:ilvl="0" w:tplc="4009000F">
+      <w:start w:val="1"/>
+      <w:numFmt w:val="decimal"/>
+      <w:lvlText w:val="%1."/>
+      <w:lvlJc w:val="left"/>
+      <w:pPr>
+        <w:ind w:left="720" w:hanging="360"/>
+      </w:pPr>
+      <w:rPr>
+        <w:rFonts w:hint="default"/>
+      </w:rPr>
+    </w:lvl>
+    <w:lvl w:ilvl="1" w:tplc="40090019" w:tentative="1">
+      <w:start w:val="1"/>
+      <w:numFmt w:val="lowerLetter"/>
+      <w:lvlText w:val="%2."/>
+      <w:lvlJc w:val="left"/>
+      <w:pPr>
+        <w:ind w:left="1440" w:hanging="360"/>
+      </w:pPr>
+    </w:lvl>
+    <w:lvl w:ilvl="2" w:tplc="4009001B" w:tentative="1">
+      <w:start w:val="1"/>
+      <w:numFmt w:val="lowerRoman"/>
+      <w:lvlText w:val="%3."/>
+      <w:lvlJc w:val="right"/>
+      <w:pPr>
+        <w:ind w:left="2160" w:hanging="180"/>
+      </w:pPr>
+    </w:lvl>
+    <w:lvl w:ilvl="3" w:tplc="4009000F" w:tentative="1">
+      <w:start w:val="1"/>
+      <w:numFmt w:val="decimal"/>
+      <w:lvlText w:val="%4."/>
+      <w:lvlJc w:val="left"/>
+      <w:pPr>
+        <w:ind w:left="2880" w:hanging="360"/>
+      </w:pPr>
+    </w:lvl>
+    <w:lvl w:ilvl="4" w:tplc="40090019" w:tentative="1">
+      <w:start w:val="1"/>
+      <w:numFmt w:val="lowerLetter"/>
+      <w:lvlText w:val="%5."/>
+      <w:lvlJc w:val="left"/>
+      <w:pPr>
+        <w:ind w:left="3600" w:hanging="360"/>
+      </w:pPr>
+    </w:lvl>
+    <w:lvl w:ilvl="5" w:tplc="4009001B" w:tentative="1">
+      <w:start w:val="1"/>
+      <w:numFmt w:val="lowerRoman"/>
+      <w:lvlText w:val="%6."/>
+      <w:lvlJc w:val="right"/>
+      <w:pPr>
+        <w:ind w:left="4320" w:hanging="180"/>
+      </w:pPr>
+    </w:lvl>
+    <w:lvl w:ilvl="6" w:tplc="4009000F" w:tentative="1">
+      <w:start w:val="1"/>
+      <w:numFmt w:val="decimal"/>
+      <w:lvlText w:val="%7."/>
+      <w:lvlJc w:val="left"/>
+      <w:pPr>
+        <w:ind w:left="5040" w:hanging="360"/>
+      </w:pPr>
+    </w:lvl>
+    <w:lvl w:ilvl="7" w:tplc="40090019" w:tentative="1">
+      <w:start w:val="1"/>
+      <w:numFmt w:val="lowerLetter"/>
+      <w:lvlText w:val="%8."/>
+      <w:lvlJc w:val="left"/>
+      <w:pPr>
+        <w:ind w:left="5760" w:hanging="360"/>
+      </w:pPr>
+    </w:lvl>
+    <w:lvl w:ilvl="8" w:tplc="4009001B" w:tentative="1">
+      <w:start w:val="1"/>
+      <w:numFmt w:val="lowerRoman"/>
+      <w:lvlText w:val="%9."/>
+      <w:lvlJc w:val="right"/>
+      <w:pPr>
+        <w:ind w:left="6480" w:hanging="180"/>
+      </w:pPr>
+    </w:lvl>
+  </w:abstractNum>
+  <w:abstractNum w:abstractNumId="1" w15:restartNumberingAfterBreak="0">
+    <w:nsid w:val="259D3164"/>
+    <w:multiLevelType w:val="hybridMultilevel"/>
+    <w:tmpl w:val="1EAAB75E"/>
+    <w:lvl w:ilvl="0" w:tplc="4009000F">
+      <w:start w:val="1"/>
+      <w:numFmt w:val="decimal"/>
+      <w:lvlText w:val="%1."/>
+      <w:lvlJc w:val="left"/>
+      <w:pPr>
+        <w:ind w:left="720" w:hanging="360"/>
+      </w:pPr>
+      <w:rPr>
+        <w:rFonts w:hint="default"/>
+      </w:rPr>
+    </w:lvl>
+    <w:lvl w:ilvl="1" w:tplc="40090019" w:tentative="1">
+      <w:start w:val="1"/>
+      <w:numFmt w:val="lowerLetter"/>
+      <w:lvlText w:val="%2."/>
+      <w:lvlJc w:val="left"/>
+      <w:pPr>
+        <w:ind w:left="1440" w:hanging="360"/>
+      </w:pPr>
+    </w:lvl>
+    <w:lvl w:ilvl="2" w:tplc="4009001B" w:tentative="1">
+      <w:start w:val="1"/>
+      <w:numFmt w:val="lowerRoman"/>
+      <w:lvlText w:val="%3."/>
+      <w:lvlJc w:val="right"/>
+      <w:pPr>
+        <w:ind w:left="2160" w:hanging="180"/>
+      </w:pPr>
+    </w:lvl>
+    <w:lvl w:ilvl="3" w:tplc="4009000F" w:tentative="1">
+      <w:start w:val="1"/>
+      <w:numFmt w:val="decimal"/>
+      <w:lvlText w:val="%4."/>
+      <w:lvlJc w:val="left"/>
+      <w:pPr>
+        <w:ind w:left="2880" w:hanging="360"/>
+      </w:pPr>
+    </w:lvl>
+    <w:lvl w:ilvl="4" w:tplc="40090019" w:tentative="1">
+      <w:start w:val="1"/>
+      <w:numFmt w:val="lowerLetter"/>
+      <w:lvlText w:val="%5."/>
+      <w:lvlJc w:val="left"/>
+      <w:pPr>
+        <w:ind w:left="3600" w:hanging="360"/>
+      </w:pPr>
+    </w:lvl>
+    <w:lvl w:ilvl="5" w:tplc="4009001B" w:tentative="1">
+      <w:start w:val="1"/>
+      <w:numFmt w:val="lowerRoman"/>
+      <w:lvlText w:val="%6."/>
+      <w:lvlJc w:val="right"/>
+      <w:pPr>
+        <w:ind w:left="4320" w:hanging="180"/>
+      </w:pPr>
+    </w:lvl>
+    <w:lvl w:ilvl="6" w:tplc="4009000F" w:tentative="1">
+      <w:start w:val="1"/>
+      <w:numFmt w:val="decimal"/>
+      <w:lvlText w:val="%7."/>
+      <w:lvlJc w:val="left"/>
+      <w:pPr>
+        <w:ind w:left="5040" w:hanging="360"/>
+      </w:pPr>
+    </w:lvl>
+    <w:lvl w:ilvl="7" w:tplc="40090019" w:tentative="1">
+      <w:start w:val="1"/>
+      <w:numFmt w:val="lowerLetter"/>
+      <w:lvlText w:val="%8."/>
+      <w:lvlJc w:val="left"/>
+      <w:pPr>
+        <w:ind w:left="5760" w:hanging="360"/>
+      </w:pPr>
+    </w:lvl>
+    <w:lvl w:ilvl="8" w:tplc="4009001B" w:tentative="1">
+      <w:start w:val="1"/>
+      <w:numFmt w:val="lowerRoman"/>
+      <w:lvlText w:val="%9."/>
+      <w:lvlJc w:val="right"/>
+      <w:pPr>
+        <w:ind w:left="6480" w:hanging="180"/>
+      </w:pPr>
+    </w:lvl>
+  </w:abstractNum>
+  <w:abstractNum w:abstractNumId="2" w15:restartNumberingAfterBreak="0">
+    <w:nsid w:val="632B2FD8"/>
+    <w:multiLevelType w:val="hybridMultilevel"/>
+    <w:tmpl w:val="F98864F6"/>
+    <w:lvl w:ilvl="0" w:tplc="4009000F">
+      <w:start w:val="1"/>
+      <w:numFmt w:val="decimal"/>
+      <w:lvlText w:val="%1."/>
+      <w:lvlJc w:val="left"/>
+      <w:pPr>
+        <w:ind w:left="720" w:hanging="360"/>
+      </w:pPr>
+      <w:rPr>
+        <w:rFonts w:hint="default"/>
+      </w:rPr>
+    </w:lvl>
+    <w:lvl w:ilvl="1" w:tplc="40090019" w:tentative="1">
+      <w:start w:val="1"/>
+      <w:numFmt w:val="lowerLetter"/>
+      <w:lvlText w:val="%2."/>
+      <w:lvlJc w:val="left"/>
+      <w:pPr>
+        <w:ind w:left="1440" w:hanging="360"/>
+      </w:pPr>
+    </w:lvl>
+    <w:lvl w:ilvl="2" w:tplc="4009001B" w:tentative="1">
+      <w:start w:val="1"/>
+      <w:numFmt w:val="lowerRoman"/>
+      <w:lvlText w:val="%3."/>
+      <w:lvlJc w:val="right"/>
+      <w:pPr>
+        <w:ind w:left="2160" w:hanging="180"/>
+      </w:pPr>
+    </w:lvl>
+    <w:lvl w:ilvl="3" w:tplc="4009000F" w:tentative="1">
+      <w:start w:val="1"/>
+      <w:numFmt w:val="decimal"/>
+      <w:lvlText w:val="%4."/>
+      <w:lvlJc w:val="left"/>
+      <w:pPr>
+        <w:ind w:left="2880" w:hanging="360"/>
+      </w:pPr>
+    </w:lvl>
+    <w:lvl w:ilvl="4" w:tplc="40090019" w:tentative="1">
+      <w:start w:val="1"/>
+      <w:numFmt w:val="lowerLetter"/>
+      <w:lvlText w:val="%5."/>
+      <w:lvlJc w:val="left"/>
+      <w:pPr>
+        <w:ind w:left="3600" w:hanging="360"/>
+      </w:pPr>
+    </w:lvl>
+    <w:lvl w:ilvl="5" w:tplc="4009001B" w:tentative="1">
+      <w:start w:val="1"/>
+      <w:numFmt w:val="lowerRoman"/>
+      <w:lvlText w:val="%6."/>
+      <w:lvlJc w:val="right"/>
+      <w:pPr>
+        <w:ind w:left="4320" w:hanging="180"/>
+      </w:pPr>
+    </w:lvl>
+    <w:lvl w:ilvl="6" w:tplc="4009000F" w:tentative="1">
+      <w:start w:val="1"/>
+      <w:numFmt w:val="decimal"/>
+      <w:lvlText w:val="%7."/>
+      <w:lvlJc w:val="left"/>
+      <w:pPr>
+        <w:ind w:left="5040" w:hanging="360"/>
+      </w:pPr>
+    </w:lvl>
+    <w:lvl w:ilvl="7" w:tplc="40090019" w:tentative="1">
+      <w:start w:val="1"/>
+      <w:numFmt w:val="lowerLetter"/>
+      <w:lvlText w:val="%8."/>
+      <w:lvlJc w:val="left"/>
+      <w:pPr>
+        <w:ind w:left="5760" w:hanging="360"/>
+      </w:pPr>
+    </w:lvl>
+    <w:lvl w:ilvl="8" w:tplc="4009001B" w:tentative="1">
+      <w:start w:val="1"/>
+      <w:numFmt w:val="lowerRoman"/>
+      <w:lvlText w:val="%9."/>
+      <w:lvlJc w:val="right"/>
+      <w:pPr>
+        <w:ind w:left="6480" w:hanging="180"/>
+      </w:pPr>
+    </w:lvl>
+  </w:abstractNum>
+  <w:num w:numId="1" w16cid:durableId="862858939">
+    <w:abstractNumId w:val="2"/>
+  </w:num>
+  <w:num w:numId="2" w16cid:durableId="140002855">
+    <w:abstractNumId w:val="0"/>
+  </w:num>
+  <w:num w:numId="3" w16cid:durableId="482164970">
+    <w:abstractNumId w:val="1"/>
+  </w:num>
+</w:numbering>
 </file>
 
 <file path=word/styles.xml><?xml version="1.0" encoding="utf-8"?>
@@ -3098,7 +4098,6 @@
   <w:style w:type="character" w:default="1" w:styleId="DefaultParagraphFont">
     <w:name w:val="Default Paragraph Font"/>
     <w:uiPriority w:val="1"/>
-    <w:semiHidden/>
     <w:unhideWhenUsed/>
   </w:style>
   <w:style w:type="table" w:default="1" w:styleId="TableNormal">

</xml_diff>

<commit_message>
added explanation for reference
</commit_message>
<xml_diff>
--- a/week8_GIT/1. git.docx
+++ b/week8_GIT/1. git.docx
@@ -62,7 +62,7 @@
           <w:lang w:val="en-US"/>
         </w:rPr>
         <w:drawing>
-          <wp:inline distT="0" distB="0" distL="0" distR="0" wp14:anchorId="2335CB1C" wp14:editId="2B8348B9">
+          <wp:inline distT="0" distB="0" distL="0" distR="0" wp14:anchorId="2335CB1C" wp14:editId="55ECC112">
             <wp:extent cx="5731510" cy="1432560"/>
             <wp:effectExtent l="0" t="0" r="2540" b="0"/>
             <wp:docPr id="1447938976" name="Picture 2"/>
@@ -484,7 +484,7 @@
           <w:lang w:val="en-US"/>
         </w:rPr>
         <w:drawing>
-          <wp:inline distT="0" distB="0" distL="0" distR="0" wp14:anchorId="46031463" wp14:editId="1841B32B">
+          <wp:inline distT="0" distB="0" distL="0" distR="0" wp14:anchorId="46031463" wp14:editId="748964CB">
             <wp:extent cx="5731510" cy="3404235"/>
             <wp:effectExtent l="0" t="0" r="2540" b="5715"/>
             <wp:docPr id="1362315233" name="Picture 7"/>
@@ -2052,6 +2052,59 @@
         <w:rPr>
           <w:lang w:val="en-US"/>
         </w:rPr>
+        <w:t>GIT PULL MERGE MESSAGES:</w:t>
+      </w:r>
+    </w:p>
+    <w:p>
+      <w:r>
+        <w:rPr>
+          <w:b/>
+          <w:bCs/>
+        </w:rPr>
+        <w:t>git pull create a merge commit</w:t>
+      </w:r>
+    </w:p>
+    <w:p>
+      <w:pPr>
+        <w:numPr>
+          <w:ilvl w:val="0"/>
+          <w:numId w:val="4"/>
+        </w:numPr>
+      </w:pPr>
+      <w:r>
+        <w:t xml:space="preserve">If your local branch and the remote branch have diverged (meaning you have new commits locally and the remote has new commits that you don't have), git pull will perform a merge. This merge operation creates a new commit, which is a "merge commit." This commit has two parents: your latest local commit and the latest remote commit. </w:t>
+      </w:r>
+    </w:p>
+    <w:p>
+      <w:r>
+        <w:rPr>
+          <w:b/>
+          <w:bCs/>
+        </w:rPr>
+        <w:t>git pull NOT create a merge commit</w:t>
+      </w:r>
+    </w:p>
+    <w:p>
+      <w:pPr>
+        <w:numPr>
+          <w:ilvl w:val="0"/>
+          <w:numId w:val="5"/>
+        </w:numPr>
+      </w:pPr>
+      <w:r>
+        <w:t>If your local branch is an ancestor of the remote branch (i.e., you haven't made any new commits locally, and the remote has new commits), Git can perform a "fast-forward" merge. In this case, Git simply moves your branch pointer to the latest remote commit, and no new commit is created. The history remains linear.</w:t>
+      </w:r>
+    </w:p>
+    <w:p>
+      <w:pPr>
+        <w:rPr>
+          <w:lang w:val="en-US"/>
+        </w:rPr>
+      </w:pPr>
+      <w:r>
+        <w:rPr>
+          <w:lang w:val="en-US"/>
+        </w:rPr>
         <w:t>Nothing changed in the merge message</w:t>
       </w:r>
       <w:r>
@@ -2126,6 +2179,7 @@
           <w:noProof/>
           <w:lang w:val="en-US"/>
         </w:rPr>
+        <w:lastRenderedPageBreak/>
         <w:drawing>
           <wp:inline distT="0" distB="0" distL="0" distR="0" wp14:anchorId="281D2D7A" wp14:editId="67816001">
             <wp:extent cx="5731510" cy="1169035"/>
@@ -2179,7 +2233,6 @@
         <w:rPr>
           <w:lang w:val="en-US"/>
         </w:rPr>
-        <w:lastRenderedPageBreak/>
         <w:t>Finally pushed, from local repo to remote repo on gitlab.</w:t>
       </w:r>
       <w:r>
@@ -2369,6 +2422,7 @@
           <w:noProof/>
           <w:lang w:val="en-US"/>
         </w:rPr>
+        <w:lastRenderedPageBreak/>
         <w:drawing>
           <wp:inline distT="0" distB="0" distL="0" distR="0" wp14:anchorId="12AF4A25" wp14:editId="7941C55F">
             <wp:extent cx="5731510" cy="1721485"/>
@@ -2442,7 +2496,6 @@
           <w:u w:val="single"/>
           <w:lang w:val="en-US"/>
         </w:rPr>
-        <w:lastRenderedPageBreak/>
         <w:t>multiInst and nosession ensures that always a new notepad++ file opens without restoring previous files to not interefere with any on-going/previous commits</w:t>
       </w:r>
       <w:r>
@@ -2580,7 +2633,21 @@
         <w:rPr>
           <w:lang w:val="en-US"/>
         </w:rPr>
-        <w:t>doesn’t create a alias</w:t>
+        <w:t xml:space="preserve">doesn’t create </w:t>
+      </w:r>
+      <w:proofErr w:type="gramStart"/>
+      <w:r>
+        <w:rPr>
+          <w:lang w:val="en-US"/>
+        </w:rPr>
+        <w:t>a</w:t>
+      </w:r>
+      <w:proofErr w:type="gramEnd"/>
+      <w:r>
+        <w:rPr>
+          <w:lang w:val="en-US"/>
+        </w:rPr>
+        <w:t xml:space="preserve"> alias</w:t>
       </w:r>
     </w:p>
     <w:p>
@@ -2598,7 +2665,35 @@
         <w:rPr>
           <w:lang w:val="en-US"/>
         </w:rPr>
-        <w:t>Typically, alias are written in .bashrc, .bash_profile files in home directory as they are automatically sourced (loaded automatically) when git bash starts and aliases can be used.</w:t>
+        <w:t xml:space="preserve">Typically, alias </w:t>
+      </w:r>
+      <w:proofErr w:type="gramStart"/>
+      <w:r>
+        <w:rPr>
+          <w:lang w:val="en-US"/>
+        </w:rPr>
+        <w:t>are</w:t>
+      </w:r>
+      <w:proofErr w:type="gramEnd"/>
+      <w:r>
+        <w:rPr>
+          <w:lang w:val="en-US"/>
+        </w:rPr>
+        <w:t xml:space="preserve"> written </w:t>
+      </w:r>
+      <w:proofErr w:type="gramStart"/>
+      <w:r>
+        <w:rPr>
+          <w:lang w:val="en-US"/>
+        </w:rPr>
+        <w:t>in .bashrc</w:t>
+      </w:r>
+      <w:proofErr w:type="gramEnd"/>
+      <w:r>
+        <w:rPr>
+          <w:lang w:val="en-US"/>
+        </w:rPr>
+        <w:t>, .bash_profile files in home directory as they are automatically sourced (loaded automatically) when git bash starts and aliases can be used.</w:t>
       </w:r>
     </w:p>
     <w:p>
@@ -2616,7 +2711,21 @@
         <w:rPr>
           <w:lang w:val="en-US"/>
         </w:rPr>
-        <w:t>Bash file will not be loaded automatically hence, aliases are not added.</w:t>
+        <w:t xml:space="preserve">Bash file will not be loaded automatically </w:t>
+      </w:r>
+      <w:proofErr w:type="gramStart"/>
+      <w:r>
+        <w:rPr>
+          <w:lang w:val="en-US"/>
+        </w:rPr>
+        <w:t>hence,</w:t>
+      </w:r>
+      <w:proofErr w:type="gramEnd"/>
+      <w:r>
+        <w:rPr>
+          <w:lang w:val="en-US"/>
+        </w:rPr>
+        <w:t xml:space="preserve"> aliases are not added.</w:t>
       </w:r>
     </w:p>
     <w:p>
@@ -2628,6 +2737,7 @@
           <w:lang w:val="en-US"/>
         </w:rPr>
       </w:pPr>
+      <w:proofErr w:type="gramStart"/>
       <w:r>
         <w:rPr>
           <w:b/>
@@ -2635,26 +2745,48 @@
           <w:u w:val="single"/>
           <w:lang w:val="en-US"/>
         </w:rPr>
-        <w:t>.basrc vs .bash_profile:</w:t>
-      </w:r>
-    </w:p>
-    <w:p>
-      <w:pPr>
+        <w:lastRenderedPageBreak/>
+        <w:t>.basrc</w:t>
+      </w:r>
+      <w:proofErr w:type="gramEnd"/>
+      <w:r>
         <w:rPr>
           <w:b/>
           <w:bCs/>
           <w:u w:val="single"/>
           <w:lang w:val="en-US"/>
         </w:rPr>
-      </w:pPr>
-      <w:r>
+        <w:t xml:space="preserve"> vs .bash_profile:</w:t>
+      </w:r>
+    </w:p>
+    <w:p>
+      <w:pPr>
         <w:rPr>
           <w:b/>
           <w:bCs/>
           <w:u w:val="single"/>
           <w:lang w:val="en-US"/>
         </w:rPr>
-        <w:t>.bashrc:</w:t>
+      </w:pPr>
+      <w:proofErr w:type="gramStart"/>
+      <w:r>
+        <w:rPr>
+          <w:b/>
+          <w:bCs/>
+          <w:u w:val="single"/>
+          <w:lang w:val="en-US"/>
+        </w:rPr>
+        <w:t>.bashrc</w:t>
+      </w:r>
+      <w:proofErr w:type="gramEnd"/>
+      <w:r>
+        <w:rPr>
+          <w:b/>
+          <w:bCs/>
+          <w:u w:val="single"/>
+          <w:lang w:val="en-US"/>
+        </w:rPr>
+        <w:t>:</w:t>
       </w:r>
     </w:p>
     <w:p>
@@ -2745,7 +2877,21 @@
         <w:rPr>
           <w:lang w:val="en-US"/>
         </w:rPr>
-        <w:t>So generally, we add a command in .bash_profile, to source .bashrc bcoz to load aliases even in log in shell.</w:t>
+        <w:t xml:space="preserve">So generally, we add a command in .bash_profile, to </w:t>
+      </w:r>
+      <w:proofErr w:type="gramStart"/>
+      <w:r>
+        <w:rPr>
+          <w:lang w:val="en-US"/>
+        </w:rPr>
+        <w:t>source .bashrc</w:t>
+      </w:r>
+      <w:proofErr w:type="gramEnd"/>
+      <w:r>
+        <w:rPr>
+          <w:lang w:val="en-US"/>
+        </w:rPr>
+        <w:t xml:space="preserve"> bcoz to load aliases even in log in shell.</w:t>
       </w:r>
     </w:p>
     <w:p>
@@ -2764,7 +2910,6 @@
           <w:u w:val="single"/>
           <w:lang w:val="en-US"/>
         </w:rPr>
-        <w:lastRenderedPageBreak/>
         <w:t>But in gitbash</w:t>
       </w:r>
       <w:r>
@@ -2776,6 +2921,7 @@
         </w:rPr>
         <w:t xml:space="preserve"> windows</w:t>
       </w:r>
+      <w:proofErr w:type="gramStart"/>
       <w:r>
         <w:rPr>
           <w:b/>
@@ -2783,8 +2929,9 @@
           <w:u w:val="single"/>
           <w:lang w:val="en-US"/>
         </w:rPr>
-        <w:t>, .basrc usually loads even if it is a login shell</w:t>
-      </w:r>
+        <w:t>, .basrc</w:t>
+      </w:r>
+      <w:proofErr w:type="gramEnd"/>
       <w:r>
         <w:rPr>
           <w:b/>
@@ -2792,7 +2939,36 @@
           <w:u w:val="single"/>
           <w:lang w:val="en-US"/>
         </w:rPr>
-        <w:t>, i.e .bash_profile is ignored.</w:t>
+        <w:t xml:space="preserve"> usually loads even if it is a login shell</w:t>
+      </w:r>
+      <w:r>
+        <w:rPr>
+          <w:b/>
+          <w:bCs/>
+          <w:u w:val="single"/>
+          <w:lang w:val="en-US"/>
+        </w:rPr>
+        <w:t xml:space="preserve">, </w:t>
+      </w:r>
+      <w:proofErr w:type="gramStart"/>
+      <w:r>
+        <w:rPr>
+          <w:b/>
+          <w:bCs/>
+          <w:u w:val="single"/>
+          <w:lang w:val="en-US"/>
+        </w:rPr>
+        <w:t>i.e</w:t>
+      </w:r>
+      <w:proofErr w:type="gramEnd"/>
+      <w:r>
+        <w:rPr>
+          <w:b/>
+          <w:bCs/>
+          <w:u w:val="single"/>
+          <w:lang w:val="en-US"/>
+        </w:rPr>
+        <w:t xml:space="preserve"> .bash_profile is ignored.</w:t>
       </w:r>
     </w:p>
     <w:p>
@@ -3061,6 +3237,7 @@
           <w:u w:val="single"/>
           <w:lang w:val="en-US"/>
         </w:rPr>
+        <w:lastRenderedPageBreak/>
         <w:t>Verified using npp command</w:t>
       </w:r>
     </w:p>
@@ -3160,7 +3337,6 @@
           <w:u w:val="single"/>
           <w:lang w:val="en-US"/>
         </w:rPr>
-        <w:lastRenderedPageBreak/>
         <w:drawing>
           <wp:inline distT="0" distB="0" distL="0" distR="0" wp14:anchorId="0A0397E4" wp14:editId="276DC460">
             <wp:extent cx="5726488" cy="1545771"/>
@@ -3395,6 +3571,155 @@
     </w:lvl>
   </w:abstractNum>
   <w:abstractNum w:abstractNumId="2" w15:restartNumberingAfterBreak="0">
+    <w:nsid w:val="5320274B"/>
+    <w:multiLevelType w:val="multilevel"/>
+    <w:tmpl w:val="4D680D32"/>
+    <w:lvl w:ilvl="0">
+      <w:start w:val="1"/>
+      <w:numFmt w:val="bullet"/>
+      <w:lvlText w:val=""/>
+      <w:lvlJc w:val="left"/>
+      <w:pPr>
+        <w:tabs>
+          <w:tab w:val="num" w:pos="720"/>
+        </w:tabs>
+        <w:ind w:left="720" w:hanging="360"/>
+      </w:pPr>
+      <w:rPr>
+        <w:rFonts w:ascii="Symbol" w:hAnsi="Symbol" w:hint="default"/>
+        <w:sz w:val="20"/>
+      </w:rPr>
+    </w:lvl>
+    <w:lvl w:ilvl="1" w:tentative="1">
+      <w:start w:val="1"/>
+      <w:numFmt w:val="bullet"/>
+      <w:lvlText w:val="o"/>
+      <w:lvlJc w:val="left"/>
+      <w:pPr>
+        <w:tabs>
+          <w:tab w:val="num" w:pos="1440"/>
+        </w:tabs>
+        <w:ind w:left="1440" w:hanging="360"/>
+      </w:pPr>
+      <w:rPr>
+        <w:rFonts w:ascii="Courier New" w:hAnsi="Courier New" w:hint="default"/>
+        <w:sz w:val="20"/>
+      </w:rPr>
+    </w:lvl>
+    <w:lvl w:ilvl="2" w:tentative="1">
+      <w:start w:val="1"/>
+      <w:numFmt w:val="bullet"/>
+      <w:lvlText w:val=""/>
+      <w:lvlJc w:val="left"/>
+      <w:pPr>
+        <w:tabs>
+          <w:tab w:val="num" w:pos="2160"/>
+        </w:tabs>
+        <w:ind w:left="2160" w:hanging="360"/>
+      </w:pPr>
+      <w:rPr>
+        <w:rFonts w:ascii="Wingdings" w:hAnsi="Wingdings" w:hint="default"/>
+        <w:sz w:val="20"/>
+      </w:rPr>
+    </w:lvl>
+    <w:lvl w:ilvl="3" w:tentative="1">
+      <w:start w:val="1"/>
+      <w:numFmt w:val="bullet"/>
+      <w:lvlText w:val=""/>
+      <w:lvlJc w:val="left"/>
+      <w:pPr>
+        <w:tabs>
+          <w:tab w:val="num" w:pos="2880"/>
+        </w:tabs>
+        <w:ind w:left="2880" w:hanging="360"/>
+      </w:pPr>
+      <w:rPr>
+        <w:rFonts w:ascii="Wingdings" w:hAnsi="Wingdings" w:hint="default"/>
+        <w:sz w:val="20"/>
+      </w:rPr>
+    </w:lvl>
+    <w:lvl w:ilvl="4" w:tentative="1">
+      <w:start w:val="1"/>
+      <w:numFmt w:val="bullet"/>
+      <w:lvlText w:val=""/>
+      <w:lvlJc w:val="left"/>
+      <w:pPr>
+        <w:tabs>
+          <w:tab w:val="num" w:pos="3600"/>
+        </w:tabs>
+        <w:ind w:left="3600" w:hanging="360"/>
+      </w:pPr>
+      <w:rPr>
+        <w:rFonts w:ascii="Wingdings" w:hAnsi="Wingdings" w:hint="default"/>
+        <w:sz w:val="20"/>
+      </w:rPr>
+    </w:lvl>
+    <w:lvl w:ilvl="5" w:tentative="1">
+      <w:start w:val="1"/>
+      <w:numFmt w:val="bullet"/>
+      <w:lvlText w:val=""/>
+      <w:lvlJc w:val="left"/>
+      <w:pPr>
+        <w:tabs>
+          <w:tab w:val="num" w:pos="4320"/>
+        </w:tabs>
+        <w:ind w:left="4320" w:hanging="360"/>
+      </w:pPr>
+      <w:rPr>
+        <w:rFonts w:ascii="Wingdings" w:hAnsi="Wingdings" w:hint="default"/>
+        <w:sz w:val="20"/>
+      </w:rPr>
+    </w:lvl>
+    <w:lvl w:ilvl="6" w:tentative="1">
+      <w:start w:val="1"/>
+      <w:numFmt w:val="bullet"/>
+      <w:lvlText w:val=""/>
+      <w:lvlJc w:val="left"/>
+      <w:pPr>
+        <w:tabs>
+          <w:tab w:val="num" w:pos="5040"/>
+        </w:tabs>
+        <w:ind w:left="5040" w:hanging="360"/>
+      </w:pPr>
+      <w:rPr>
+        <w:rFonts w:ascii="Wingdings" w:hAnsi="Wingdings" w:hint="default"/>
+        <w:sz w:val="20"/>
+      </w:rPr>
+    </w:lvl>
+    <w:lvl w:ilvl="7" w:tentative="1">
+      <w:start w:val="1"/>
+      <w:numFmt w:val="bullet"/>
+      <w:lvlText w:val=""/>
+      <w:lvlJc w:val="left"/>
+      <w:pPr>
+        <w:tabs>
+          <w:tab w:val="num" w:pos="5760"/>
+        </w:tabs>
+        <w:ind w:left="5760" w:hanging="360"/>
+      </w:pPr>
+      <w:rPr>
+        <w:rFonts w:ascii="Wingdings" w:hAnsi="Wingdings" w:hint="default"/>
+        <w:sz w:val="20"/>
+      </w:rPr>
+    </w:lvl>
+    <w:lvl w:ilvl="8" w:tentative="1">
+      <w:start w:val="1"/>
+      <w:numFmt w:val="bullet"/>
+      <w:lvlText w:val=""/>
+      <w:lvlJc w:val="left"/>
+      <w:pPr>
+        <w:tabs>
+          <w:tab w:val="num" w:pos="6480"/>
+        </w:tabs>
+        <w:ind w:left="6480" w:hanging="360"/>
+      </w:pPr>
+      <w:rPr>
+        <w:rFonts w:ascii="Wingdings" w:hAnsi="Wingdings" w:hint="default"/>
+        <w:sz w:val="20"/>
+      </w:rPr>
+    </w:lvl>
+  </w:abstractNum>
+  <w:abstractNum w:abstractNumId="3" w15:restartNumberingAfterBreak="0">
     <w:nsid w:val="632B2FD8"/>
     <w:multiLevelType w:val="hybridMultilevel"/>
     <w:tmpl w:val="F98864F6"/>
@@ -3483,14 +3808,169 @@
       </w:pPr>
     </w:lvl>
   </w:abstractNum>
+  <w:abstractNum w:abstractNumId="4" w15:restartNumberingAfterBreak="0">
+    <w:nsid w:val="67D405B6"/>
+    <w:multiLevelType w:val="multilevel"/>
+    <w:tmpl w:val="A62A1D2C"/>
+    <w:lvl w:ilvl="0">
+      <w:start w:val="1"/>
+      <w:numFmt w:val="bullet"/>
+      <w:lvlText w:val=""/>
+      <w:lvlJc w:val="left"/>
+      <w:pPr>
+        <w:tabs>
+          <w:tab w:val="num" w:pos="720"/>
+        </w:tabs>
+        <w:ind w:left="720" w:hanging="360"/>
+      </w:pPr>
+      <w:rPr>
+        <w:rFonts w:ascii="Symbol" w:hAnsi="Symbol" w:hint="default"/>
+        <w:sz w:val="20"/>
+      </w:rPr>
+    </w:lvl>
+    <w:lvl w:ilvl="1" w:tentative="1">
+      <w:start w:val="1"/>
+      <w:numFmt w:val="bullet"/>
+      <w:lvlText w:val="o"/>
+      <w:lvlJc w:val="left"/>
+      <w:pPr>
+        <w:tabs>
+          <w:tab w:val="num" w:pos="1440"/>
+        </w:tabs>
+        <w:ind w:left="1440" w:hanging="360"/>
+      </w:pPr>
+      <w:rPr>
+        <w:rFonts w:ascii="Courier New" w:hAnsi="Courier New" w:hint="default"/>
+        <w:sz w:val="20"/>
+      </w:rPr>
+    </w:lvl>
+    <w:lvl w:ilvl="2" w:tentative="1">
+      <w:start w:val="1"/>
+      <w:numFmt w:val="bullet"/>
+      <w:lvlText w:val=""/>
+      <w:lvlJc w:val="left"/>
+      <w:pPr>
+        <w:tabs>
+          <w:tab w:val="num" w:pos="2160"/>
+        </w:tabs>
+        <w:ind w:left="2160" w:hanging="360"/>
+      </w:pPr>
+      <w:rPr>
+        <w:rFonts w:ascii="Wingdings" w:hAnsi="Wingdings" w:hint="default"/>
+        <w:sz w:val="20"/>
+      </w:rPr>
+    </w:lvl>
+    <w:lvl w:ilvl="3" w:tentative="1">
+      <w:start w:val="1"/>
+      <w:numFmt w:val="bullet"/>
+      <w:lvlText w:val=""/>
+      <w:lvlJc w:val="left"/>
+      <w:pPr>
+        <w:tabs>
+          <w:tab w:val="num" w:pos="2880"/>
+        </w:tabs>
+        <w:ind w:left="2880" w:hanging="360"/>
+      </w:pPr>
+      <w:rPr>
+        <w:rFonts w:ascii="Wingdings" w:hAnsi="Wingdings" w:hint="default"/>
+        <w:sz w:val="20"/>
+      </w:rPr>
+    </w:lvl>
+    <w:lvl w:ilvl="4" w:tentative="1">
+      <w:start w:val="1"/>
+      <w:numFmt w:val="bullet"/>
+      <w:lvlText w:val=""/>
+      <w:lvlJc w:val="left"/>
+      <w:pPr>
+        <w:tabs>
+          <w:tab w:val="num" w:pos="3600"/>
+        </w:tabs>
+        <w:ind w:left="3600" w:hanging="360"/>
+      </w:pPr>
+      <w:rPr>
+        <w:rFonts w:ascii="Wingdings" w:hAnsi="Wingdings" w:hint="default"/>
+        <w:sz w:val="20"/>
+      </w:rPr>
+    </w:lvl>
+    <w:lvl w:ilvl="5" w:tentative="1">
+      <w:start w:val="1"/>
+      <w:numFmt w:val="bullet"/>
+      <w:lvlText w:val=""/>
+      <w:lvlJc w:val="left"/>
+      <w:pPr>
+        <w:tabs>
+          <w:tab w:val="num" w:pos="4320"/>
+        </w:tabs>
+        <w:ind w:left="4320" w:hanging="360"/>
+      </w:pPr>
+      <w:rPr>
+        <w:rFonts w:ascii="Wingdings" w:hAnsi="Wingdings" w:hint="default"/>
+        <w:sz w:val="20"/>
+      </w:rPr>
+    </w:lvl>
+    <w:lvl w:ilvl="6" w:tentative="1">
+      <w:start w:val="1"/>
+      <w:numFmt w:val="bullet"/>
+      <w:lvlText w:val=""/>
+      <w:lvlJc w:val="left"/>
+      <w:pPr>
+        <w:tabs>
+          <w:tab w:val="num" w:pos="5040"/>
+        </w:tabs>
+        <w:ind w:left="5040" w:hanging="360"/>
+      </w:pPr>
+      <w:rPr>
+        <w:rFonts w:ascii="Wingdings" w:hAnsi="Wingdings" w:hint="default"/>
+        <w:sz w:val="20"/>
+      </w:rPr>
+    </w:lvl>
+    <w:lvl w:ilvl="7" w:tentative="1">
+      <w:start w:val="1"/>
+      <w:numFmt w:val="bullet"/>
+      <w:lvlText w:val=""/>
+      <w:lvlJc w:val="left"/>
+      <w:pPr>
+        <w:tabs>
+          <w:tab w:val="num" w:pos="5760"/>
+        </w:tabs>
+        <w:ind w:left="5760" w:hanging="360"/>
+      </w:pPr>
+      <w:rPr>
+        <w:rFonts w:ascii="Wingdings" w:hAnsi="Wingdings" w:hint="default"/>
+        <w:sz w:val="20"/>
+      </w:rPr>
+    </w:lvl>
+    <w:lvl w:ilvl="8" w:tentative="1">
+      <w:start w:val="1"/>
+      <w:numFmt w:val="bullet"/>
+      <w:lvlText w:val=""/>
+      <w:lvlJc w:val="left"/>
+      <w:pPr>
+        <w:tabs>
+          <w:tab w:val="num" w:pos="6480"/>
+        </w:tabs>
+        <w:ind w:left="6480" w:hanging="360"/>
+      </w:pPr>
+      <w:rPr>
+        <w:rFonts w:ascii="Wingdings" w:hAnsi="Wingdings" w:hint="default"/>
+        <w:sz w:val="20"/>
+      </w:rPr>
+    </w:lvl>
+  </w:abstractNum>
   <w:num w:numId="1" w16cid:durableId="862858939">
-    <w:abstractNumId w:val="2"/>
+    <w:abstractNumId w:val="3"/>
   </w:num>
   <w:num w:numId="2" w16cid:durableId="140002855">
     <w:abstractNumId w:val="0"/>
   </w:num>
   <w:num w:numId="3" w16cid:durableId="482164970">
     <w:abstractNumId w:val="1"/>
+  </w:num>
+  <w:num w:numId="4" w16cid:durableId="1038553314">
+    <w:abstractNumId w:val="2"/>
+  </w:num>
+  <w:num w:numId="5" w16cid:durableId="1052847410">
+    <w:abstractNumId w:val="4"/>
   </w:num>
 </w:numbering>
 </file>

</xml_diff>